<commit_message>
update RFQ invitation email template to match Fortune Procurement design system
Co-Authored-By: Claude Sonnet 4.6 <noreply@anthropic.com>
</commit_message>
<xml_diff>
--- a/docs/UAT-Fortune-Procurement-System.docx
+++ b/docs/UAT-Fortune-Procurement-System.docx
@@ -3847,7 +3847,7 @@
                 <w:b w:val="0"/>
                 <w:sz w:val="18"/>
               </w:rPr>
-              <w:t>Allowed</w:t>
+              <w:t xml:space="preserve">/tsqa — Allowed; /accreditation — Blocked (TSQA removed from accreditation route)</w:t>
             </w:r>
           </w:p>
         </w:tc>
@@ -6652,7 +6652,7 @@
                 <w:b w:val="0"/>
                 <w:sz w:val="18"/>
               </w:rPr>
-              <w:t>Status set to "Pending Warehouse Validation"; warehouse notified</w:t>
+              <w:t>Status set to "Pending Approval"; approvers notified (step 1 of PR1_APPROVAL workflow)</w:t>
             </w:r>
           </w:p>
         </w:tc>
@@ -14502,7 +14502,7 @@
                 <w:b w:val="0"/>
                 <w:sz w:val="18"/>
               </w:rPr>
-              <w:t>PO created, prefilled supplier + line items</w:t>
+              <w:t>PO created in draft status, prefilled with supplier name and awarded line items; buyer must enter PO number manually; one PO generated per awarded supplier</w:t>
             </w:r>
           </w:p>
         </w:tc>
@@ -29564,7 +29564,7 @@
                 <w:b w:val="0"/>
                 <w:sz w:val="18"/>
               </w:rPr>
-              <w:t>Warehouse notified</w:t>
+              <w:t>Approvers notified (step 1 of PR1_APPROVAL workflow); warehouse notified only after final approval step</w:t>
             </w:r>
           </w:p>
         </w:tc>
@@ -32588,7 +32588,7 @@
                 <w:b w:val="0"/>
                 <w:sz w:val="18"/>
               </w:rPr>
-              <w:t>Status: Pending Warehouse Validation</w:t>
+              <w:t>Status: Pending Approval</w:t>
             </w:r>
           </w:p>
         </w:tc>
@@ -32636,44 +32636,37 @@
                 <w:b w:val="0"/>
                 <w:sz w:val="18"/>
               </w:rPr>
-              <w:t>Warehouse</w:t>
-            </w:r>
-          </w:p>
-        </w:tc>
-        <w:tc>
-          <w:tcPr>
-            <w:tcW w:type="dxa" w:w="1440"/>
-          </w:tcPr>
-          <w:p>
-            <w:r/>
-            <w:r>
-              <w:rPr>
-                <w:b w:val="0"/>
-                <w:sz w:val="18"/>
-              </w:rPr>
-              <w:t xml:space="preserve">Validate, mark </w:t>
-            </w:r>
-            <w:r>
-              <w:rPr>
-                <w:b/>
-                <w:sz w:val="18"/>
-              </w:rPr>
-              <w:t>Insufficient</w:t>
-            </w:r>
-          </w:p>
-        </w:tc>
-        <w:tc>
-          <w:tcPr>
-            <w:tcW w:type="dxa" w:w="1440"/>
-          </w:tcPr>
-          <w:p>
-            <w:r/>
-            <w:r>
-              <w:rPr>
-                <w:b w:val="0"/>
-                <w:sz w:val="18"/>
-              </w:rPr>
-              <w:t>Item routed to procurement</w:t>
+              <w:t>Approver(s)</w:t>
+            </w:r>
+          </w:p>
+        </w:tc>
+        <w:tc>
+          <w:tcPr>
+            <w:tcW w:type="dxa" w:w="1440"/>
+          </w:tcPr>
+          <w:p>
+            <w:r/>
+            <w:r>
+              <w:rPr>
+                <w:b w:val="0"/>
+                <w:sz w:val="18"/>
+              </w:rPr>
+              <w:t>Approve PR1 (2 steps)</w:t>
+            </w:r>
+          </w:p>
+        </w:tc>
+        <w:tc>
+          <w:tcPr>
+            <w:tcW w:type="dxa" w:w="1440"/>
+          </w:tcPr>
+          <w:p>
+            <w:r/>
+            <w:r>
+              <w:rPr>
+                <w:b w:val="0"/>
+                <w:sz w:val="18"/>
+              </w:rPr>
+              <w:t>PR1 approved; status → Approved — Awaiting Warehouse; warehouse notified</w:t>
             </w:r>
           </w:p>
         </w:tc>
@@ -32721,37 +32714,44 @@
                 <w:b w:val="0"/>
                 <w:sz w:val="18"/>
               </w:rPr>
-              <w:t>Approver(s)</w:t>
-            </w:r>
-          </w:p>
-        </w:tc>
-        <w:tc>
-          <w:tcPr>
-            <w:tcW w:type="dxa" w:w="1440"/>
-          </w:tcPr>
-          <w:p>
-            <w:r/>
-            <w:r>
-              <w:rPr>
-                <w:b w:val="0"/>
-                <w:sz w:val="18"/>
-              </w:rPr>
-              <w:t>Approve PR1 (2 steps)</w:t>
-            </w:r>
-          </w:p>
-        </w:tc>
-        <w:tc>
-          <w:tcPr>
-            <w:tcW w:type="dxa" w:w="1440"/>
-          </w:tcPr>
-          <w:p>
-            <w:r/>
-            <w:r>
-              <w:rPr>
-                <w:b w:val="0"/>
-                <w:sz w:val="18"/>
-              </w:rPr>
-              <w:t>PR1 approved</w:t>
+              <w:t>Warehouse</w:t>
+            </w:r>
+          </w:p>
+        </w:tc>
+        <w:tc>
+          <w:tcPr>
+            <w:tcW w:type="dxa" w:w="1440"/>
+          </w:tcPr>
+          <w:p>
+            <w:r/>
+            <w:r>
+              <w:rPr>
+                <w:b w:val="0"/>
+                <w:sz w:val="18"/>
+              </w:rPr>
+              <w:t xml:space="preserve">Validate, mark </w:t>
+            </w:r>
+            <w:r>
+              <w:rPr>
+                <w:b/>
+                <w:sz w:val="18"/>
+              </w:rPr>
+              <w:t>Insufficient</w:t>
+            </w:r>
+          </w:p>
+        </w:tc>
+        <w:tc>
+          <w:tcPr>
+            <w:tcW w:type="dxa" w:w="1440"/>
+          </w:tcPr>
+          <w:p>
+            <w:r/>
+            <w:r>
+              <w:rPr>
+                <w:b w:val="0"/>
+                <w:sz w:val="18"/>
+              </w:rPr>
+              <w:t>Item routed to procurement (for_canvassing)</w:t>
             </w:r>
           </w:p>
         </w:tc>
@@ -34966,7 +34966,7 @@
                 <w:b w:val="0"/>
                 <w:sz w:val="18"/>
               </w:rPr>
-              <w:t>Pending Warehouse Validation</w:t>
+              <w:t>Pending Approval</w:t>
             </w:r>
           </w:p>
         </w:tc>

</xml_diff>